<commit_message>
update documentation and example
</commit_message>
<xml_diff>
--- a/downloads/BeginnerGuide/usingElements/output.docx
+++ b/downloads/BeginnerGuide/usingElements/output.docx
@@ -410,12 +410,12 @@
             <w:tcW w:w="150" w:type="dxa"/>
             <w:shd w:val="clear" w:color="auto" w:fill="eb4034"/>
             <w:tcBorders>
-              <w:top w:val="double" w:sz="4" w:space="4" w:color="#0000ff"/>
-              <w:bottom w:val="dotted" w:sz="4" w:space="10" w:color="00ff00"/>
-              <w:left w:val="triple" w:sz="20" w:space="10" w:color="#ffff00"/>
-              <w:right w:val="wave" w:sz="38" w:space="8" w:color="#800080"/>
-              <w:tl2br w:val="single" w:sz="18" w:space="3" w:color="#ffc0cb"/>
-              <w:tr2bl w:val="thick" w:sz="15" w:space="15" w:color="#ffa500"/>
+              <w:top w:val="double" w:sz="10" w:space="0" w:color="red"/>
+              <w:bottom w:val="double" w:sz="10" w:space="0" w:color="red"/>
+              <w:left w:val="double" w:sz="10" w:space="0" w:color="red"/>
+              <w:right w:val="double" w:sz="10" w:space="0" w:color="red"/>
+              <w:tl2br w:val="single" w:sz="4" w:space="0" w:color="auto"/>
+              <w:tr2bl w:val="thick" w:sz="4" w:space="0" w:color="#ffa500"/>
             </w:tcBorders>
           </w:tcPr>
           <w:p>

</xml_diff>